<commit_message>
docs: add role-based cost breakdown
</commit_message>
<xml_diff>
--- a/exports/media-rules-export.docx
+++ b/exports/media-rules-export.docx
@@ -864,27 +864,37 @@
     </w:p>
     <w:p>
       <w:r>
-        <w:t xml:space="preserve">Этап | Срок | Стоимость | Результат</w:t>
-      </w:r>
-    </w:p>
-    <w:p>
-      <w:r>
-        <w:t xml:space="preserve">1. Аналитика | 3–4 недели | 2,4 млн ₽ | требования, схема данных, правила классификации, backlog, прототип JSON Schema</w:t>
-      </w:r>
-    </w:p>
-    <w:p>
-      <w:r>
-        <w:t xml:space="preserve">2. Разработка MVP | 8–10 недель | 6,9 млн ₽ | рабочий MVP: загрузка брифов, extraction в JSON, классификация, validation, warnings, базовый UI/API</w:t>
-      </w:r>
-    </w:p>
-    <w:p>
-      <w:r>
-        <w:t xml:space="preserve">3. Полное решение | 14–18 недель | 10,2 млн ₽ | production-решение: справочники, правила подбора, расчёты KPI, Excel-генерация, роли, хранение, журналирование</w:t>
-      </w:r>
-    </w:p>
-    <w:p>
-      <w:r>
-        <w:t xml:space="preserve">Итого | 25–32 недели | 19,5 млн ₽ | полный цикл от аналитики до рабочего решения</w:t>
+        <w:t xml:space="preserve">Базовая расчётная ставка: 4 000 ₽/час. В ставку заложены разработка, аналитика, управление, тестирование, DevOps, документация и проектные риски.</w:t>
+      </w:r>
+    </w:p>
+    <w:p>
+      <w:r>
+        <w:t xml:space="preserve"/>
+      </w:r>
+    </w:p>
+    <w:p>
+      <w:r>
+        <w:t xml:space="preserve">Этап | Срок | Часы | Стоимость | Результат</w:t>
+      </w:r>
+    </w:p>
+    <w:p>
+      <w:r>
+        <w:t xml:space="preserve">1. Аналитика | 3–4 недели | 600 ч | 2,4 млн ₽ | требования, схема данных, правила классификации, backlog, JSON Schema</w:t>
+      </w:r>
+    </w:p>
+    <w:p>
+      <w:r>
+        <w:t xml:space="preserve">2. Разработка MVP | 8–10 недель | 1 725 ч | 6,9 млн ₽ | загрузка брифов, extraction в JSON, классификация, validation, warnings, базовый UI/API</w:t>
+      </w:r>
+    </w:p>
+    <w:p>
+      <w:r>
+        <w:t xml:space="preserve">3. Полное решение | 14–18 недель | 2 550 ч | 10,2 млн ₽ | справочники, правила подбора, расчёты KPI, Excel-генерация, роли, хранение, журналирование</w:t>
+      </w:r>
+    </w:p>
+    <w:p>
+      <w:r>
+        <w:t xml:space="preserve">Итого | 25–32 недели | 4 875 ч | 19,5 млн ₽ | полный цикл от аналитики до рабочего решения</w:t>
       </w:r>
     </w:p>
     <w:p>
@@ -897,6 +907,94 @@
         <w:pStyle w:val="Heading3"/>
       </w:pPr>
       <w:r>
+        <w:t xml:space="preserve">Команда и роли</w:t>
+      </w:r>
+    </w:p>
+    <w:p>
+      <w:r>
+        <w:t xml:space="preserve"/>
+      </w:r>
+    </w:p>
+    <w:p>
+      <w:r>
+        <w:t xml:space="preserve">Роль | Участие | Зона ответственности</w:t>
+      </w:r>
+    </w:p>
+    <w:p>
+      <w:r>
+        <w:t xml:space="preserve">Product / бизнес-аналитик | 0,5–1 FTE | требования, сценарии, приёмка, backlog, коммуникация с медиапланерами</w:t>
+      </w:r>
+    </w:p>
+    <w:p>
+      <w:r>
+        <w:t xml:space="preserve">Системный аналитик | 0,5–1 FTE | JSON Schema, правила, валидации, модели данных, интеграционные контракты</w:t>
+      </w:r>
+    </w:p>
+    <w:p>
+      <w:r>
+        <w:t xml:space="preserve">Tech Lead / архитектор | 0,3–0,7 FTE | архитектура, технические решения, ревью, качество реализации</w:t>
+      </w:r>
+    </w:p>
+    <w:p>
+      <w:r>
+        <w:t xml:space="preserve">Backend-разработчик | 1–2 FTE | API, хранение, парсинг файлов, бизнес-логика, расчёты</w:t>
+      </w:r>
+    </w:p>
+    <w:p>
+      <w:r>
+        <w:t xml:space="preserve">Frontend-разработчик | 0,5–1 FTE | web-интерфейс, upload, просмотр JSON, редактирование, экспорт</w:t>
+      </w:r>
+    </w:p>
+    <w:p>
+      <w:r>
+        <w:t xml:space="preserve">ML/LLM engineer | 0,5–1 FTE | extraction, prompts, JSON Schema, качество распознавания, regression-тесты</w:t>
+      </w:r>
+    </w:p>
+    <w:p>
+      <w:r>
+        <w:t xml:space="preserve">QA engineer | 0,3–1 FTE | тест-кейсы, проверка исторических брифов, регрессия, приёмочные проверки</w:t>
+      </w:r>
+    </w:p>
+    <w:p>
+      <w:r>
+        <w:t xml:space="preserve">DevOps engineer | 0,2–0,5 FTE | окружения, деплой, мониторинг, секреты, CI/CD</w:t>
+      </w:r>
+    </w:p>
+    <w:p>
+      <w:r>
+        <w:t xml:space="preserve">Project manager | 0,3–0,5 FTE | план, риски, сроки, статус, координация команды</w:t>
+      </w:r>
+    </w:p>
+    <w:p>
+      <w:r>
+        <w:t xml:space="preserve"/>
+      </w:r>
+    </w:p>
+    <w:p>
+      <w:r>
+        <w:t xml:space="preserve">FTE указаны ориентировочно: на разных этапах состав команды меняется. Например, на аналитике больше аналитиков, на MVP больше backend/LLM, на полном решении добавляются QA, DevOps и frontend.</w:t>
+      </w:r>
+    </w:p>
+    <w:p>
+      <w:r>
+        <w:t xml:space="preserve"/>
+      </w:r>
+    </w:p>
+    <w:p>
+      <w:r>
+        <w:t xml:space="preserve">---</w:t>
+      </w:r>
+    </w:p>
+    <w:p>
+      <w:r>
+        <w:t xml:space="preserve"/>
+      </w:r>
+    </w:p>
+    <w:p>
+      <w:pPr>
+        <w:pStyle w:val="Heading3"/>
+      </w:pPr>
+      <w:r>
         <w:t xml:space="preserve">1. Аналитика</w:t>
       </w:r>
     </w:p>
@@ -917,68 +1015,57 @@
     </w:p>
     <w:p>
       <w:r>
-        <w:t xml:space="preserve">Работы:</w:t>
-      </w:r>
-    </w:p>
-    <w:p>
-      <w:r>
-        <w:t xml:space="preserve"/>
-      </w:r>
-    </w:p>
-    <w:p>
-      <w:pPr>
-        <w:ind w:left="360"/>
-      </w:pPr>
-      <w:r>
-        <w:t xml:space="preserve">• разбор исторических пар “бриф → медиаплан”;</w:t>
-      </w:r>
-    </w:p>
-    <w:p>
-      <w:pPr>
-        <w:ind w:left="360"/>
-      </w:pPr>
-      <w:r>
-        <w:t xml:space="preserve">• описание типов кампаний и правил классификации;</w:t>
-      </w:r>
-    </w:p>
-    <w:p>
-      <w:pPr>
-        <w:ind w:left="360"/>
-      </w:pPr>
-      <w:r>
-        <w:t xml:space="preserve">• проектирование нормализованного JSON;</w:t>
-      </w:r>
-    </w:p>
-    <w:p>
-      <w:pPr>
-        <w:ind w:left="360"/>
-      </w:pPr>
-      <w:r>
-        <w:t xml:space="preserve">• описание hard-stop/warning валидаций;</w:t>
-      </w:r>
-    </w:p>
-    <w:p>
-      <w:pPr>
-        <w:ind w:left="360"/>
-      </w:pPr>
-      <w:r>
-        <w:t xml:space="preserve">• описание справочников: площадки, форматы, KPI, НДС/АК, гео, ЦА;</w:t>
-      </w:r>
-    </w:p>
-    <w:p>
-      <w:pPr>
-        <w:ind w:left="360"/>
-      </w:pPr>
-      <w:r>
-        <w:t xml:space="preserve">• подготовка backlog для MVP и полного решения;</w:t>
-      </w:r>
-    </w:p>
-    <w:p>
-      <w:pPr>
-        <w:ind w:left="360"/>
-      </w:pPr>
-      <w:r>
-        <w:t xml:space="preserve">• согласование критериев приёмки.</w:t>
+        <w:t xml:space="preserve">Срок: 3–4 недели.  </w:t>
+      </w:r>
+    </w:p>
+    <w:p>
+      <w:r>
+        <w:t xml:space="preserve">Оценка: 600 ч × 4 000 ₽ = 2,4 млн ₽.</w:t>
+      </w:r>
+    </w:p>
+    <w:p>
+      <w:r>
+        <w:t xml:space="preserve"/>
+      </w:r>
+    </w:p>
+    <w:p>
+      <w:r>
+        <w:t xml:space="preserve">Блок работ | Длительность | Роли | Часы | Стоимость</w:t>
+      </w:r>
+    </w:p>
+    <w:p>
+      <w:r>
+        <w:t xml:space="preserve">Разбор исторических пар “бриф → медиаплан” | 1–1,5 недели | BA, системный аналитик, медиапланинг SME | 120 ч | 480 тыс. ₽</w:t>
+      </w:r>
+    </w:p>
+    <w:p>
+      <w:r>
+        <w:t xml:space="preserve">Описание типов кампаний и правил классификации | 1 неделя | BA, системный аналитик, LLM engineer | 100 ч | 400 тыс. ₽</w:t>
+      </w:r>
+    </w:p>
+    <w:p>
+      <w:r>
+        <w:t xml:space="preserve">Проектирование JSON Schema и модели данных | 1 неделя | системный аналитик, Tech Lead | 120 ч | 480 тыс. ₽</w:t>
+      </w:r>
+    </w:p>
+    <w:p>
+      <w:r>
+        <w:t xml:space="preserve">Описание hard-stop/warning validation | 0,5–1 неделя | BA, системный аналитик, QA | 80 ч | 320 тыс. ₽</w:t>
+      </w:r>
+    </w:p>
+    <w:p>
+      <w:r>
+        <w:t xml:space="preserve">Backlog MVP и полного решения | 0,5 недели | Product, Tech Lead, PM | 80 ч | 320 тыс. ₽</w:t>
+      </w:r>
+    </w:p>
+    <w:p>
+      <w:r>
+        <w:t xml:space="preserve">Критерии приёмки, оценка рисков, документация | 0,5 недели | Product, PM, Tech Lead | 100 ч | 400 тыс. ₽</w:t>
+      </w:r>
+    </w:p>
+    <w:p>
+      <w:r>
+        <w:t xml:space="preserve">Итого | 3–4 недели |  | 600 ч | 2,4 млн ₽</w:t>
       </w:r>
     </w:p>
     <w:p>
@@ -997,6 +1084,16 @@
       </w:r>
     </w:p>
     <w:p>
+      <w:r>
+        <w:t xml:space="preserve">---</w:t>
+      </w:r>
+    </w:p>
+    <w:p>
+      <w:r>
+        <w:t xml:space="preserve"/>
+      </w:r>
+    </w:p>
+    <w:p>
       <w:pPr>
         <w:pStyle w:val="Heading3"/>
       </w:pPr>
@@ -1021,92 +1118,67 @@
     </w:p>
     <w:p>
       <w:r>
-        <w:t xml:space="preserve">Работы:</w:t>
-      </w:r>
-    </w:p>
-    <w:p>
-      <w:r>
-        <w:t xml:space="preserve"/>
-      </w:r>
-    </w:p>
-    <w:p>
-      <w:pPr>
-        <w:ind w:left="360"/>
-      </w:pPr>
-      <w:r>
-        <w:t xml:space="preserve">• загрузка .txt, .docx, .pptx;</w:t>
-      </w:r>
-    </w:p>
-    <w:p>
-      <w:pPr>
-        <w:ind w:left="360"/>
-      </w:pPr>
-      <w:r>
-        <w:t xml:space="preserve">• извлечение текста из файлов;</w:t>
-      </w:r>
-    </w:p>
-    <w:p>
-      <w:pPr>
-        <w:ind w:left="360"/>
-      </w:pPr>
-      <w:r>
-        <w:t xml:space="preserve">• LLM extraction по JSON Schema;</w:t>
-      </w:r>
-    </w:p>
-    <w:p>
-      <w:pPr>
-        <w:ind w:left="360"/>
-      </w:pPr>
-      <w:r>
-        <w:t xml:space="preserve">• rule-based классификация типа кампании;</w:t>
-      </w:r>
-    </w:p>
-    <w:p>
-      <w:pPr>
-        <w:ind w:left="360"/>
-      </w:pPr>
-      <w:r>
-        <w:t xml:space="preserve">• нормализация бюджета, периода, гео, KPI, каналов и форматов;</w:t>
-      </w:r>
-    </w:p>
-    <w:p>
-      <w:pPr>
-        <w:ind w:left="360"/>
-      </w:pPr>
-      <w:r>
-        <w:t xml:space="preserve">• validation: missing fields, hard-stop, warnings;</w:t>
-      </w:r>
-    </w:p>
-    <w:p>
-      <w:pPr>
-        <w:ind w:left="360"/>
-      </w:pPr>
-      <w:r>
-        <w:t xml:space="preserve">• простой web-интерфейс или API;</w:t>
-      </w:r>
-    </w:p>
-    <w:p>
-      <w:pPr>
-        <w:ind w:left="360"/>
-      </w:pPr>
-      <w:r>
-        <w:t xml:space="preserve">• просмотр и экспорт JSON;</w:t>
-      </w:r>
-    </w:p>
-    <w:p>
-      <w:pPr>
-        <w:ind w:left="360"/>
-      </w:pPr>
-      <w:r>
-        <w:t xml:space="preserve">• прогон на 10 исторических кейсах;</w:t>
-      </w:r>
-    </w:p>
-    <w:p>
-      <w:pPr>
-        <w:ind w:left="360"/>
-      </w:pPr>
-      <w:r>
-        <w:t xml:space="preserve">• базовая документация и инструкция пользователя.</w:t>
+        <w:t xml:space="preserve">Срок: 8–10 недель.  </w:t>
+      </w:r>
+    </w:p>
+    <w:p>
+      <w:r>
+        <w:t xml:space="preserve">Оценка: 1 725 ч × 4 000 ₽ = 6,9 млн ₽.</w:t>
+      </w:r>
+    </w:p>
+    <w:p>
+      <w:r>
+        <w:t xml:space="preserve"/>
+      </w:r>
+    </w:p>
+    <w:p>
+      <w:r>
+        <w:t xml:space="preserve">Блок работ | Длительность | Роли | Часы | Стоимость</w:t>
+      </w:r>
+    </w:p>
+    <w:p>
+      <w:r>
+        <w:t xml:space="preserve">Архитектура MVP, репозиторий, окружения, CI/CD | 1 неделя | Tech Lead, Backend, DevOps | 160 ч | 640 тыс. ₽</w:t>
+      </w:r>
+    </w:p>
+    <w:p>
+      <w:r>
+        <w:t xml:space="preserve">Парсинг .txt, .docx, .pptx в текст | 1–1,5 недели | Backend, QA | 180 ч | 720 тыс. ₽</w:t>
+      </w:r>
+    </w:p>
+    <w:p>
+      <w:r>
+        <w:t xml:space="preserve">LLM extraction по JSON Schema | 2 недели | LLM engineer, Backend, системный аналитик | 320 ч | 1,28 млн ₽</w:t>
+      </w:r>
+    </w:p>
+    <w:p>
+      <w:r>
+        <w:t xml:space="preserve">Rule classifier: HR, CPL, context, OLV, influencer, retail, multi-object | 1,5–2 недели | Backend, LLM engineer, BA | 260 ч | 1,04 млн ₽</w:t>
+      </w:r>
+    </w:p>
+    <w:p>
+      <w:r>
+        <w:t xml:space="preserve">Validator: missing fields, hard-stop, warnings | 1 неделя | Backend, системный аналитик, QA | 180 ч | 720 тыс. ₽</w:t>
+      </w:r>
+    </w:p>
+    <w:p>
+      <w:r>
+        <w:t xml:space="preserve">Базовый web UI/API: upload, просмотр JSON, экспорт | 2 недели | Frontend, Backend | 300 ч | 1,2 млн ₽</w:t>
+      </w:r>
+    </w:p>
+    <w:p>
+      <w:r>
+        <w:t xml:space="preserve">Прогон на 10 исторических брифах и regression checks | 1 неделя | QA, BA, LLM engineer | 160 ч | 640 тыс. ₽</w:t>
+      </w:r>
+    </w:p>
+    <w:p>
+      <w:r>
+        <w:t xml:space="preserve">Документация, demo-сценарий, стабилизация | 0,5–1 неделя | PM, QA, Tech Lead, BA | 165 ч | 660 тыс. ₽</w:t>
+      </w:r>
+    </w:p>
+    <w:p>
+      <w:r>
+        <w:t xml:space="preserve">Итого | 8–10 недель |  | 1 725 ч | 6,9 млн ₽</w:t>
       </w:r>
     </w:p>
     <w:p>
@@ -1125,6 +1197,16 @@
       </w:r>
     </w:p>
     <w:p>
+      <w:r>
+        <w:t xml:space="preserve">---</w:t>
+      </w:r>
+    </w:p>
+    <w:p>
+      <w:r>
+        <w:t xml:space="preserve"/>
+      </w:r>
+    </w:p>
+    <w:p>
       <w:pPr>
         <w:pStyle w:val="Heading3"/>
       </w:pPr>
@@ -1149,92 +1231,72 @@
     </w:p>
     <w:p>
       <w:r>
-        <w:t xml:space="preserve">Работы:</w:t>
-      </w:r>
-    </w:p>
-    <w:p>
-      <w:r>
-        <w:t xml:space="preserve"/>
-      </w:r>
-    </w:p>
-    <w:p>
-      <w:pPr>
-        <w:ind w:left="360"/>
-      </w:pPr>
-      <w:r>
-        <w:t xml:space="preserve">• справочник площадок, форматов, ставок и ограничений;</w:t>
-      </w:r>
-    </w:p>
-    <w:p>
-      <w:pPr>
-        <w:ind w:left="360"/>
-      </w:pPr>
-      <w:r>
-        <w:t xml:space="preserve">• правила подбора площадок и форматов;</w:t>
-      </w:r>
-    </w:p>
-    <w:p>
-      <w:pPr>
-        <w:ind w:left="360"/>
-      </w:pPr>
-      <w:r>
-        <w:t xml:space="preserve">• расчёт базовых KPI: CPM, CPC, CPL, показы, клики, лиды, охват;</w:t>
-      </w:r>
-    </w:p>
-    <w:p>
-      <w:pPr>
-        <w:ind w:left="360"/>
-      </w:pPr>
-      <w:r>
-        <w:t xml:space="preserve">• генерация Excel по 2–3 основным шаблонам;</w:t>
-      </w:r>
-    </w:p>
-    <w:p>
-      <w:pPr>
-        <w:ind w:left="360"/>
-      </w:pPr>
-      <w:r>
-        <w:t xml:space="preserve">• хранение проектов и версий результатов;</w:t>
-      </w:r>
-    </w:p>
-    <w:p>
-      <w:pPr>
-        <w:ind w:left="360"/>
-      </w:pPr>
-      <w:r>
-        <w:t xml:space="preserve">• роли пользователей и базовые права доступа;</w:t>
-      </w:r>
-    </w:p>
-    <w:p>
-      <w:pPr>
-        <w:ind w:left="360"/>
-      </w:pPr>
-      <w:r>
-        <w:t xml:space="preserve">• журналирование действий и ошибок;</w:t>
-      </w:r>
-    </w:p>
-    <w:p>
-      <w:pPr>
-        <w:ind w:left="360"/>
-      </w:pPr>
-      <w:r>
-        <w:t xml:space="preserve">• административные настройки справочников;</w:t>
-      </w:r>
-    </w:p>
-    <w:p>
-      <w:pPr>
-        <w:ind w:left="360"/>
-      </w:pPr>
-      <w:r>
-        <w:t xml:space="preserve">• тестирование, стабилизация, документация;</w:t>
-      </w:r>
-    </w:p>
-    <w:p>
-      <w:pPr>
-        <w:ind w:left="360"/>
-      </w:pPr>
-      <w:r>
-        <w:t xml:space="preserve">• подготовка к пилотной эксплуатации.</w:t>
+        <w:t xml:space="preserve">Срок: 14–18 недель.  </w:t>
+      </w:r>
+    </w:p>
+    <w:p>
+      <w:r>
+        <w:t xml:space="preserve">Оценка: 2 550 ч × 4 000 ₽ = 10,2 млн ₽.</w:t>
+      </w:r>
+    </w:p>
+    <w:p>
+      <w:r>
+        <w:t xml:space="preserve"/>
+      </w:r>
+    </w:p>
+    <w:p>
+      <w:r>
+        <w:t xml:space="preserve">Блок работ | Длительность | Роли | Часы | Стоимость</w:t>
+      </w:r>
+    </w:p>
+    <w:p>
+      <w:r>
+        <w:t xml:space="preserve">Справочники площадок, форматов, ставок, ограничений | 2–3 недели | Backend, системный аналитик, BA | 360 ч | 1,44 млн ₽</w:t>
+      </w:r>
+    </w:p>
+    <w:p>
+      <w:r>
+        <w:t xml:space="preserve">Правила подбора площадок и форматов | 2 недели | Backend, LLM engineer, медиапланинг SME | 320 ч | 1,28 млн ₽</w:t>
+      </w:r>
+    </w:p>
+    <w:p>
+      <w:r>
+        <w:t xml:space="preserve">Расчёт KPI: CPM, CPC, CPL, показы, клики, лиды, охват | 2 недели | Backend, системный аналитик, QA | 300 ч | 1,2 млн ₽</w:t>
+      </w:r>
+    </w:p>
+    <w:p>
+      <w:r>
+        <w:t xml:space="preserve">Генерация Excel по 2–3 основным шаблонам | 2–3 недели | Backend, QA, BA | 360 ч | 1,44 млн ₽</w:t>
+      </w:r>
+    </w:p>
+    <w:p>
+      <w:r>
+        <w:t xml:space="preserve">Хранение проектов, версий результатов и история изменений | 1,5–2 недели | Backend, Frontend | 280 ч | 1,12 млн ₽</w:t>
+      </w:r>
+    </w:p>
+    <w:p>
+      <w:r>
+        <w:t xml:space="preserve">Пользователи, роли, базовые права доступа | 1 неделя | Backend, Frontend, DevOps | 180 ч | 720 тыс. ₽</w:t>
+      </w:r>
+    </w:p>
+    <w:p>
+      <w:r>
+        <w:t xml:space="preserve">Административный интерфейс для справочников | 1,5–2 недели | Frontend, Backend | 260 ч | 1,04 млн ₽</w:t>
+      </w:r>
+    </w:p>
+    <w:p>
+      <w:r>
+        <w:t xml:space="preserve">Журналирование, мониторинг, эксплуатационные настройки | 1 неделя | DevOps, Backend | 170 ч | 680 тыс. ₽</w:t>
+      </w:r>
+    </w:p>
+    <w:p>
+      <w:r>
+        <w:t xml:space="preserve">Полное тестирование, стабилизация, пилотная документация | 2 недели | QA, PM, Tech Lead, BA | 320 ч | 1,28 млн ₽</w:t>
+      </w:r>
+    </w:p>
+    <w:p>
+      <w:r>
+        <w:t xml:space="preserve">Итого | 14–18 недель |  | 2 550 ч | 10,2 млн ₽</w:t>
       </w:r>
     </w:p>
     <w:p>
@@ -1253,6 +1315,16 @@
       </w:r>
     </w:p>
     <w:p>
+      <w:r>
+        <w:t xml:space="preserve">---</w:t>
+      </w:r>
+    </w:p>
+    <w:p>
+      <w:r>
+        <w:t xml:space="preserve"/>
+      </w:r>
+    </w:p>
+    <w:p>
       <w:pPr>
         <w:pStyle w:val="Heading3"/>
       </w:pPr>
@@ -1267,7 +1339,7 @@
     </w:p>
     <w:p>
       <w:r>
-        <w:t xml:space="preserve">Бюджет полного цикла — 19,5 млн ₽. Это оставляет запас до 20 млн ₽ и снижает риск недооценки: аналитика закрывает неопределённость, MVP быстро даёт проверяемый результат, полный этап добавляет расчёты, справочники и production-качество.</w:t>
+        <w:t xml:space="preserve">Бюджет полного цикла — 19,5 млн ₽. Он считается по единой ставке 4 000 ₽/час и суммарной трудоёмкости 4 875 часов. Это оставляет запас до 20 млн ₽ и снижает риск недооценки: аналитика закрывает неопределённость, MVP быстро даёт проверяемый результат, полный этап добавляет расчёты, справочники и production-качество.</w:t>
       </w:r>
     </w:p>
     <w:sectPr>

</xml_diff>

<commit_message>
docs: revise estimate to 12m and local parsing stack
</commit_message>
<xml_diff>
--- a/exports/media-rules-export.docx
+++ b/exports/media-rules-export.docx
@@ -1,6 +1,6 @@
 
 <file path=word/document.xml><?xml version="1.0" encoding="utf-8"?>
-<w:document xmlns:w="http://schemas.openxmlformats.org/wordprocessingml/2006/main" xmlns:r="http://schemas.openxmlformats.org/officeDocument/2006/relationships">
+<w:document xmlns:w="http://schemas.openxmlformats.org/wordprocessingml/2006/main">
   <w:body>
     <w:p>
       <w:pPr>
@@ -173,7 +173,7 @@
         <w:ind w:left="360"/>
       </w:pPr>
       <w:r>
-        <w:t xml:space="preserve">5. Исторические пары — не ML-датасет, а база правил, few-shot примеров и regression-тестов.</w:t>
+        <w:t xml:space="preserve">5. Исторические пары — база правил, примеров и регрессионных проверок, а не источник для автоматических обещаний без проверки.</w:t>
       </w:r>
     </w:p>
     <w:p>
@@ -297,7 +297,7 @@
         <w:ind w:left="360"/>
       </w:pPr>
       <w:r>
-        <w:t xml:space="preserve">• полностью автономный “идеальный” медиаплан;</w:t>
+        <w:t xml:space="preserve">• финальный медиаплан без проверки специалистом;</w:t>
       </w:r>
     </w:p>
     <w:p>
@@ -313,7 +313,7 @@
         <w:ind w:left="360"/>
       </w:pPr>
       <w:r>
-        <w:t xml:space="preserve">• ML-прогноз без фактических данных;</w:t>
+        <w:t xml:space="preserve">• прогнозирование без фактических данных и утверждённых бенчмарков;</w:t>
       </w:r>
     </w:p>
     <w:p>
@@ -454,7 +454,7 @@
       </w:pPr>
       <w:r>
         <w:rPr>
-          <w:rFonts w:ascii="Courier New" w:hAnsi="Courier New" w:cs="Courier New"/>
+          <w:rFonts w:ascii="Courier New" w:hAnsi="Courier New"/>
           <w:sz w:val="18"/>
         </w:rPr>
         <w:t xml:space="preserve">{</w:t>
@@ -569,39 +569,39 @@
         <w:ind w:left="360"/>
       </w:pPr>
       <w:r>
-        <w:t xml:space="preserve">2. LLM extractor — извлекает поля по JSON Schema.</w:t>
-      </w:r>
-    </w:p>
-    <w:p>
-      <w:pPr>
-        <w:ind w:left="360"/>
-      </w:pPr>
-      <w:r>
-        <w:t xml:space="preserve">3. Rule classifier — определяет тип кампании: HR, performance/CPL, context, OLV/banner, influencer, retail media, multi-object, historical planning.</w:t>
-      </w:r>
-    </w:p>
-    <w:p>
-      <w:pPr>
-        <w:ind w:left="360"/>
-      </w:pPr>
-      <w:r>
-        <w:t xml:space="preserve">4. Validator — разделяет hard-stop и warning: нет бюджета, периода, гео, KPI, неясен НДС, указано “по бенчам”, но бенчи не приложены.</w:t>
-      </w:r>
-    </w:p>
-    <w:p>
-      <w:pPr>
-        <w:ind w:left="360"/>
-      </w:pPr>
-      <w:r>
-        <w:t xml:space="preserve">5. Normalizer — приводит бюджет, даты, гео, каналы, KPI и форматы к единому виду.</w:t>
-      </w:r>
-    </w:p>
-    <w:p>
-      <w:pPr>
-        <w:ind w:left="360"/>
-      </w:pPr>
-      <w:r>
-        <w:t xml:space="preserve">6. Output — JSON, человекочитаемый summary, позже Excel draft.</w:t>
+        <w:t xml:space="preserve">2. Модуль извлечения данных — извлекает поля по JSON Schema на базе Ollama + Qwen2.5 32B Instruct.</w:t>
+      </w:r>
+    </w:p>
+    <w:p>
+      <w:pPr>
+        <w:ind w:left="360"/>
+      </w:pPr>
+      <w:r>
+        <w:t xml:space="preserve">3. Классификатор правил — определяет тип кампании: HR, performance/CPL, context, OLV/banner, блогеры, retail media, multi-object, historical planning.</w:t>
+      </w:r>
+    </w:p>
+    <w:p>
+      <w:pPr>
+        <w:ind w:left="360"/>
+      </w:pPr>
+      <w:r>
+        <w:t xml:space="preserve">4. Валидатор — разделяет критичные ошибки и предупреждения: нет бюджета, периода, гео, KPI, неясен НДС, указано “по бенчам”, но бенчи не приложены.</w:t>
+      </w:r>
+    </w:p>
+    <w:p>
+      <w:pPr>
+        <w:ind w:left="360"/>
+      </w:pPr>
+      <w:r>
+        <w:t xml:space="preserve">5. Нормализатор — приводит бюджет, даты, гео, каналы, KPI и форматы к единому виду.</w:t>
+      </w:r>
+    </w:p>
+    <w:p>
+      <w:pPr>
+        <w:ind w:left="360"/>
+      </w:pPr>
+      <w:r>
+        <w:t xml:space="preserve">6. Результат — JSON, краткое резюме для пользователя, позже Excel-черновик.</w:t>
       </w:r>
     </w:p>
     <w:p>
@@ -653,7 +653,7 @@
         <w:ind w:left="360"/>
       </w:pPr>
       <w:r>
-        <w:t xml:space="preserve">• JSON extraction;</w:t>
+        <w:t xml:space="preserve">• извлечение данных в JSON;</w:t>
       </w:r>
     </w:p>
     <w:p>
@@ -687,7 +687,7 @@
     </w:p>
     <w:p>
       <w:r>
-        <w:t xml:space="preserve">Нормальный demo-прототип: 1–2 недели</w:t>
+        <w:t xml:space="preserve">Нормальный демо-прототип: 1–2 недели</w:t>
       </w:r>
     </w:p>
     <w:p>
@@ -708,15 +708,15 @@
         <w:ind w:left="360"/>
       </w:pPr>
       <w:r>
-        <w:t xml:space="preserve">• upload файла;</w:t>
-      </w:r>
-    </w:p>
-    <w:p>
-      <w:pPr>
-        <w:ind w:left="360"/>
-      </w:pPr>
-      <w:r>
-        <w:t xml:space="preserve">• просмотр extracted JSON;</w:t>
+        <w:t xml:space="preserve">• загрузка файла;</w:t>
+      </w:r>
+    </w:p>
+    <w:p>
+      <w:pPr>
+        <w:ind w:left="360"/>
+      </w:pPr>
+      <w:r>
+        <w:t xml:space="preserve">• просмотр извлечённого JSON;</w:t>
       </w:r>
     </w:p>
     <w:p>
@@ -808,7 +808,7 @@
         <w:pStyle w:val="Heading3"/>
       </w:pPr>
       <w:r>
-        <w:t xml:space="preserve">Presale-формулировка</w:t>
+        <w:t xml:space="preserve">Формулировка для предложения</w:t>
       </w:r>
     </w:p>
     <w:p>
@@ -821,7 +821,7 @@
         <w:ind w:left="720"/>
       </w:pPr>
       <w:r>
-        <w:t xml:space="preserve">За 1–2 недели можно сделать demo-прототип, который принимает реальный бриф и возвращает структурированный JSON с классификацией кампании, вводными, недостающими полями и рекомендацией следующего шага.</w:t>
+        <w:t xml:space="preserve">За 1–2 недели можно сделать демо-прототип, который принимает реальный бриф и возвращает структурированный JSON с классификацией кампании, вводными, недостающими полями и рекомендацией следующего шага.</w:t>
       </w:r>
     </w:p>
     <w:p>
@@ -844,6 +844,56 @@
         <w:pStyle w:val="Heading2"/>
       </w:pPr>
       <w:r>
+        <w:t xml:space="preserve">Требования безопасности</w:t>
+      </w:r>
+    </w:p>
+    <w:p>
+      <w:r>
+        <w:t xml:space="preserve"/>
+      </w:r>
+    </w:p>
+    <w:p>
+      <w:r>
+        <w:t xml:space="preserve">Для разбора брифов используется локальный контур заказчика:</w:t>
+      </w:r>
+    </w:p>
+    <w:p>
+      <w:r>
+        <w:t xml:space="preserve"/>
+      </w:r>
+    </w:p>
+    <w:p>
+      <w:pPr>
+        <w:spacing w:before="120" w:after="120"/>
+      </w:pPr>
+      <w:r>
+        <w:rPr>
+          <w:rFonts w:ascii="Courier New" w:hAnsi="Courier New"/>
+          <w:sz w:val="18"/>
+        </w:rPr>
+        <w:t xml:space="preserve">Ollama + Qwen2.5 32B Instruct</w:t>
+      </w:r>
+    </w:p>
+    <w:p>
+      <w:r>
+        <w:t xml:space="preserve"/>
+      </w:r>
+    </w:p>
+    <w:p>
+      <w:r>
+        <w:t xml:space="preserve">Брифы, исторические медиапланы, справочники, ставки, клиентские данные и промежуточные JSON не отправляются во внешние облачные сервисы. Модель разворачивается на инфраструктуре заказчика или в выделенном закрытом окружении, согласованном с требованиями ИБ.</w:t>
+      </w:r>
+    </w:p>
+    <w:p>
+      <w:r>
+        <w:t xml:space="preserve"/>
+      </w:r>
+    </w:p>
+    <w:p>
+      <w:pPr>
+        <w:pStyle w:val="Heading2"/>
+      </w:pPr>
+      <w:r>
         <w:t xml:space="preserve">Оценка этапов проекта</w:t>
       </w:r>
     </w:p>
@@ -864,7 +914,7 @@
     </w:p>
     <w:p>
       <w:r>
-        <w:t xml:space="preserve">Базовая расчётная ставка: 4 000 ₽/час. В ставку заложены разработка, аналитика, управление, тестирование, DevOps, документация и проектные риски.</w:t>
+        <w:t xml:space="preserve">Базовая расчётная ставка: 4 000 ₽/час. Расчёт ниже сделан по трудоёмкости: роли → задачи → часы → стоимость.</w:t>
       </w:r>
     </w:p>
     <w:p>
@@ -879,22 +929,22 @@
     </w:p>
     <w:p>
       <w:r>
-        <w:t xml:space="preserve">1. Аналитика | 3–4 недели | 600 ч | 2,4 млн ₽ | требования, схема данных, правила классификации, backlog, JSON Schema</w:t>
-      </w:r>
-    </w:p>
-    <w:p>
-      <w:r>
-        <w:t xml:space="preserve">2. Разработка MVP | 8–10 недель | 1 725 ч | 6,9 млн ₽ | загрузка брифов, extraction в JSON, классификация, validation, warnings, базовый UI/API</w:t>
-      </w:r>
-    </w:p>
-    <w:p>
-      <w:r>
-        <w:t xml:space="preserve">3. Полное решение | 14–18 недель | 2 550 ч | 10,2 млн ₽ | справочники, правила подбора, расчёты KPI, Excel-генерация, роли, хранение, журналирование</w:t>
-      </w:r>
-    </w:p>
-    <w:p>
-      <w:r>
-        <w:t xml:space="preserve">Итого | 25–32 недели | 4 875 ч | 19,5 млн ₽ | полный цикл от аналитики до рабочего решения</w:t>
+        <w:t xml:space="preserve">1. Аналитика | 2–3 недели | 400 ч | 1,6 млн ₽ | требования, схема данных, правила классификации, backlog, JSON Schema</w:t>
+      </w:r>
+    </w:p>
+    <w:p>
+      <w:r>
+        <w:t xml:space="preserve">2. Разработка MVP | 5–7 недель | 950 ч | 3,8 млн ₽ | загрузка брифов, извлечение в JSON, классификация, валидация, предупреждения, базовый UI/API</w:t>
+      </w:r>
+    </w:p>
+    <w:p>
+      <w:r>
+        <w:t xml:space="preserve">3. Полное решение | 10–14 недель | 1 650 ч | 6,6 млн ₽ | справочники, правила подбора, расчёты KPI, Excel-генерация, роли, хранение, журналирование</w:t>
+      </w:r>
+    </w:p>
+    <w:p>
+      <w:r>
+        <w:t xml:space="preserve">Итого | 17–24 недели | 3 000 ч | 12,0 млн ₽ | полный цикл от аналитики до рабочего решения</w:t>
       </w:r>
     </w:p>
     <w:p>
@@ -922,57 +972,57 @@
     </w:p>
     <w:p>
       <w:r>
-        <w:t xml:space="preserve">Product / бизнес-аналитик | 0,5–1 FTE | требования, сценарии, приёмка, backlog, коммуникация с медиапланерами</w:t>
-      </w:r>
-    </w:p>
-    <w:p>
-      <w:r>
-        <w:t xml:space="preserve">Системный аналитик | 0,5–1 FTE | JSON Schema, правила, валидации, модели данных, интеграционные контракты</w:t>
-      </w:r>
-    </w:p>
-    <w:p>
-      <w:r>
-        <w:t xml:space="preserve">Tech Lead / архитектор | 0,3–0,7 FTE | архитектура, технические решения, ревью, качество реализации</w:t>
-      </w:r>
-    </w:p>
-    <w:p>
-      <w:r>
-        <w:t xml:space="preserve">Backend-разработчик | 1–2 FTE | API, хранение, парсинг файлов, бизнес-логика, расчёты</w:t>
-      </w:r>
-    </w:p>
-    <w:p>
-      <w:r>
-        <w:t xml:space="preserve">Frontend-разработчик | 0,5–1 FTE | web-интерфейс, upload, просмотр JSON, редактирование, экспорт</w:t>
-      </w:r>
-    </w:p>
-    <w:p>
-      <w:r>
-        <w:t xml:space="preserve">ML/LLM engineer | 0,5–1 FTE | extraction, prompts, JSON Schema, качество распознавания, regression-тесты</w:t>
-      </w:r>
-    </w:p>
-    <w:p>
-      <w:r>
-        <w:t xml:space="preserve">QA engineer | 0,3–1 FTE | тест-кейсы, проверка исторических брифов, регрессия, приёмочные проверки</w:t>
-      </w:r>
-    </w:p>
-    <w:p>
-      <w:r>
-        <w:t xml:space="preserve">DevOps engineer | 0,2–0,5 FTE | окружения, деплой, мониторинг, секреты, CI/CD</w:t>
-      </w:r>
-    </w:p>
-    <w:p>
-      <w:r>
-        <w:t xml:space="preserve">Project manager | 0,3–0,5 FTE | план, риски, сроки, статус, координация команды</w:t>
-      </w:r>
-    </w:p>
-    <w:p>
-      <w:r>
-        <w:t xml:space="preserve"/>
-      </w:r>
-    </w:p>
-    <w:p>
-      <w:r>
-        <w:t xml:space="preserve">FTE указаны ориентировочно: на разных этапах состав команды меняется. Например, на аналитике больше аналитиков, на MVP больше backend/LLM, на полном решении добавляются QA, DevOps и frontend.</w:t>
+        <w:t xml:space="preserve">Product / бизнес-аналитик | 0,4–0,8 FTE | требования, сценарии, приёмка, backlog, коммуникация с медиапланерами</w:t>
+      </w:r>
+    </w:p>
+    <w:p>
+      <w:r>
+        <w:t xml:space="preserve">Системный аналитик | 0,4–0,8 FTE | JSON Schema, правила, валидации, модели данных, интеграционные контракты</w:t>
+      </w:r>
+    </w:p>
+    <w:p>
+      <w:r>
+        <w:t xml:space="preserve">Технический лидер / архитектор | 0,2–0,5 FTE | архитектура, технические решения, ревью, качество реализации</w:t>
+      </w:r>
+    </w:p>
+    <w:p>
+      <w:r>
+        <w:t xml:space="preserve">Backend-разработчик | 1–1,5 FTE | API, хранение, парсинг файлов, бизнес-логика, расчёты</w:t>
+      </w:r>
+    </w:p>
+    <w:p>
+      <w:r>
+        <w:t xml:space="preserve">Frontend-разработчик | 0,3–0,8 FTE | web-интерфейс, загрузка файлов, просмотр JSON, редактирование, экспорт</w:t>
+      </w:r>
+    </w:p>
+    <w:p>
+      <w:r>
+        <w:t xml:space="preserve">Инженер по извлечению данных | 0,4–0,8 FTE | Ollama + Qwen2.5 32B Instruct, JSON Schema, качество извлечения, регрессионные проверки</w:t>
+      </w:r>
+    </w:p>
+    <w:p>
+      <w:r>
+        <w:t xml:space="preserve">QA-инженер | 0,3–0,8 FTE | тест-кейсы, проверка исторических брифов, регрессия, приёмочные проверки</w:t>
+      </w:r>
+    </w:p>
+    <w:p>
+      <w:r>
+        <w:t xml:space="preserve">DevOps-инженер | 0,2–0,4 FTE | закрытое окружение, деплой, мониторинг, секреты, CI/CD</w:t>
+      </w:r>
+    </w:p>
+    <w:p>
+      <w:r>
+        <w:t xml:space="preserve">Руководитель проекта | 0,2–0,4 FTE | план, риски, сроки, статус, координация команды</w:t>
+      </w:r>
+    </w:p>
+    <w:p>
+      <w:r>
+        <w:t xml:space="preserve"/>
+      </w:r>
+    </w:p>
+    <w:p>
+      <w:r>
+        <w:t xml:space="preserve">FTE указаны ориентировочно: на разных этапах состав команды меняется. На аналитике больше аналитиков, на MVP больше backend и извлечения данных, на полном решении добавляются QA, DevOps и frontend.</w:t>
       </w:r>
     </w:p>
     <w:p>
@@ -1015,12 +1065,12 @@
     </w:p>
     <w:p>
       <w:r>
-        <w:t xml:space="preserve">Срок: 3–4 недели.  </w:t>
-      </w:r>
-    </w:p>
-    <w:p>
-      <w:r>
-        <w:t xml:space="preserve">Оценка: 600 ч × 4 000 ₽ = 2,4 млн ₽.</w:t>
+        <w:t xml:space="preserve">Срок: 2–3 недели.  </w:t>
+      </w:r>
+    </w:p>
+    <w:p>
+      <w:r>
+        <w:t xml:space="preserve">Оценка: 400 ч × 4 000 ₽ = 1,6 млн ₽.</w:t>
       </w:r>
     </w:p>
     <w:p>
@@ -1035,37 +1085,37 @@
     </w:p>
     <w:p>
       <w:r>
-        <w:t xml:space="preserve">Разбор исторических пар “бриф → медиаплан” | 1–1,5 недели | BA, системный аналитик, медиапланинг SME | 120 ч | 480 тыс. ₽</w:t>
-      </w:r>
-    </w:p>
-    <w:p>
-      <w:r>
-        <w:t xml:space="preserve">Описание типов кампаний и правил классификации | 1 неделя | BA, системный аналитик, LLM engineer | 100 ч | 400 тыс. ₽</w:t>
-      </w:r>
-    </w:p>
-    <w:p>
-      <w:r>
-        <w:t xml:space="preserve">Проектирование JSON Schema и модели данных | 1 неделя | системный аналитик, Tech Lead | 120 ч | 480 тыс. ₽</w:t>
-      </w:r>
-    </w:p>
-    <w:p>
-      <w:r>
-        <w:t xml:space="preserve">Описание hard-stop/warning validation | 0,5–1 неделя | BA, системный аналитик, QA | 80 ч | 320 тыс. ₽</w:t>
-      </w:r>
-    </w:p>
-    <w:p>
-      <w:r>
-        <w:t xml:space="preserve">Backlog MVP и полного решения | 0,5 недели | Product, Tech Lead, PM | 80 ч | 320 тыс. ₽</w:t>
-      </w:r>
-    </w:p>
-    <w:p>
-      <w:r>
-        <w:t xml:space="preserve">Критерии приёмки, оценка рисков, документация | 0,5 недели | Product, PM, Tech Lead | 100 ч | 400 тыс. ₽</w:t>
-      </w:r>
-    </w:p>
-    <w:p>
-      <w:r>
-        <w:t xml:space="preserve">Итого | 3–4 недели |  | 600 ч | 2,4 млн ₽</w:t>
+        <w:t xml:space="preserve">Разбор исторических пар “бриф → медиаплан” | 0,5–1 неделя | BA, системный аналитик, медиапланинг SME | 80 ч | 320 тыс. ₽</w:t>
+      </w:r>
+    </w:p>
+    <w:p>
+      <w:r>
+        <w:t xml:space="preserve">Описание типов кампаний и правил классификации | 0,5 недели | BA, системный аналитик, инженер по извлечению данных | 70 ч | 280 тыс. ₽</w:t>
+      </w:r>
+    </w:p>
+    <w:p>
+      <w:r>
+        <w:t xml:space="preserve">Проектирование JSON Schema и модели данных | 0,5–1 неделя | системный аналитик, Технический лидер | 80 ч | 320 тыс. ₽</w:t>
+      </w:r>
+    </w:p>
+    <w:p>
+      <w:r>
+        <w:t xml:space="preserve">Описание hard-stop/warning validation | 0,5 недели | BA, системный аналитик, QA | 60 ч | 240 тыс. ₽</w:t>
+      </w:r>
+    </w:p>
+    <w:p>
+      <w:r>
+        <w:t xml:space="preserve">Backlog MVP и полного решения | 0,5 недели | Product, Технический лидер, PM | 50 ч | 200 тыс. ₽</w:t>
+      </w:r>
+    </w:p>
+    <w:p>
+      <w:r>
+        <w:t xml:space="preserve">Критерии приёмки, оценка рисков, документация | 0,5 недели | Product, PM, Технический лидер | 60 ч | 240 тыс. ₽</w:t>
+      </w:r>
+    </w:p>
+    <w:p>
+      <w:r>
+        <w:t xml:space="preserve">Итого | 2–3 недели |  | 400 ч | 1,6 млн ₽</w:t>
       </w:r>
     </w:p>
     <w:p>
@@ -1108,22 +1158,22 @@
     </w:p>
     <w:p>
       <w:r>
-        <w:t xml:space="preserve">Цель: сделать рабочий продуктовый прототип, который принимает реальный бриф и возвращает структурированный результат для медиапланера.</w:t>
-      </w:r>
-    </w:p>
-    <w:p>
-      <w:r>
-        <w:t xml:space="preserve"/>
-      </w:r>
-    </w:p>
-    <w:p>
-      <w:r>
-        <w:t xml:space="preserve">Срок: 8–10 недель.  </w:t>
-      </w:r>
-    </w:p>
-    <w:p>
-      <w:r>
-        <w:t xml:space="preserve">Оценка: 1 725 ч × 4 000 ₽ = 6,9 млн ₽.</w:t>
+        <w:t xml:space="preserve">Цель: сделать компактный рабочий MVP, который принимает реальный бриф и возвращает структурированный результат для медиапланера.</w:t>
+      </w:r>
+    </w:p>
+    <w:p>
+      <w:r>
+        <w:t xml:space="preserve"/>
+      </w:r>
+    </w:p>
+    <w:p>
+      <w:r>
+        <w:t xml:space="preserve">Срок: 5–7 недель.  </w:t>
+      </w:r>
+    </w:p>
+    <w:p>
+      <w:r>
+        <w:t xml:space="preserve">Оценка: 950 ч × 4 000 ₽ = 3,8 млн ₽.</w:t>
       </w:r>
     </w:p>
     <w:p>
@@ -1138,57 +1188,57 @@
     </w:p>
     <w:p>
       <w:r>
-        <w:t xml:space="preserve">Архитектура MVP, репозиторий, окружения, CI/CD | 1 неделя | Tech Lead, Backend, DevOps | 160 ч | 640 тыс. ₽</w:t>
-      </w:r>
-    </w:p>
-    <w:p>
-      <w:r>
-        <w:t xml:space="preserve">Парсинг .txt, .docx, .pptx в текст | 1–1,5 недели | Backend, QA | 180 ч | 720 тыс. ₽</w:t>
-      </w:r>
-    </w:p>
-    <w:p>
-      <w:r>
-        <w:t xml:space="preserve">LLM extraction по JSON Schema | 2 недели | LLM engineer, Backend, системный аналитик | 320 ч | 1,28 млн ₽</w:t>
-      </w:r>
-    </w:p>
-    <w:p>
-      <w:r>
-        <w:t xml:space="preserve">Rule classifier: HR, CPL, context, OLV, influencer, retail, multi-object | 1,5–2 недели | Backend, LLM engineer, BA | 260 ч | 1,04 млн ₽</w:t>
-      </w:r>
-    </w:p>
-    <w:p>
-      <w:r>
-        <w:t xml:space="preserve">Validator: missing fields, hard-stop, warnings | 1 неделя | Backend, системный аналитик, QA | 180 ч | 720 тыс. ₽</w:t>
-      </w:r>
-    </w:p>
-    <w:p>
-      <w:r>
-        <w:t xml:space="preserve">Базовый web UI/API: upload, просмотр JSON, экспорт | 2 недели | Frontend, Backend | 300 ч | 1,2 млн ₽</w:t>
-      </w:r>
-    </w:p>
-    <w:p>
-      <w:r>
-        <w:t xml:space="preserve">Прогон на 10 исторических брифах и regression checks | 1 неделя | QA, BA, LLM engineer | 160 ч | 640 тыс. ₽</w:t>
-      </w:r>
-    </w:p>
-    <w:p>
-      <w:r>
-        <w:t xml:space="preserve">Документация, demo-сценарий, стабилизация | 0,5–1 неделя | PM, QA, Tech Lead, BA | 165 ч | 660 тыс. ₽</w:t>
-      </w:r>
-    </w:p>
-    <w:p>
-      <w:r>
-        <w:t xml:space="preserve">Итого | 8–10 недель |  | 1 725 ч | 6,9 млн ₽</w:t>
-      </w:r>
-    </w:p>
-    <w:p>
-      <w:r>
-        <w:t xml:space="preserve"/>
-      </w:r>
-    </w:p>
-    <w:p>
-      <w:r>
-        <w:t xml:space="preserve">Результат: MVP, пригодный для presale/demo и внутренней проверки на реальных брифах.</w:t>
+        <w:t xml:space="preserve">Архитектура MVP, репозиторий, окружения, CI/CD | 0,5 недели | Технический лидер, Backend, DevOps | 90 ч | 360 тыс. ₽</w:t>
+      </w:r>
+    </w:p>
+    <w:p>
+      <w:r>
+        <w:t xml:space="preserve">Парсинг .txt, .docx, .pptx в текст | 0,5–1 неделя | Backend, QA | 110 ч | 440 тыс. ₽</w:t>
+      </w:r>
+    </w:p>
+    <w:p>
+      <w:r>
+        <w:t xml:space="preserve">Локальный контур Ollama + Qwen2.5 32B Instruct | 0,5–1 неделя | инженер по извлечению данных, DevOps, Backend | 140 ч | 560 тыс. ₽</w:t>
+      </w:r>
+    </w:p>
+    <w:p>
+      <w:r>
+        <w:t xml:space="preserve">Извлечение данных по JSON Schema | 1–1,5 недели | инженер по извлечению данных, Backend, системный аналитик | 170 ч | 680 тыс. ₽</w:t>
+      </w:r>
+    </w:p>
+    <w:p>
+      <w:r>
+        <w:t xml:space="preserve">Классификация кампаний и базовые правила | 0,5–1 неделя | Backend, системный аналитик, BA | 120 ч | 480 тыс. ₽</w:t>
+      </w:r>
+    </w:p>
+    <w:p>
+      <w:r>
+        <w:t xml:space="preserve">Валидатор: недостающие поля, критичные ошибки, предупреждения | 0,5 недели | Backend, системный аналитик, QA | 90 ч | 360 тыс. ₽</w:t>
+      </w:r>
+    </w:p>
+    <w:p>
+      <w:r>
+        <w:t xml:space="preserve">Базовый web UI/API: загрузка, просмотр JSON, экспорт | 1–1,5 недели | Frontend, Backend | 150 ч | 600 тыс. ₽</w:t>
+      </w:r>
+    </w:p>
+    <w:p>
+      <w:r>
+        <w:t xml:space="preserve">Прогон на 10 исторических брифах и регрессионные проверки | 0,5 недели | QA, BA, инженер по извлечению данных | 80 ч | 320 тыс. ₽</w:t>
+      </w:r>
+    </w:p>
+    <w:p>
+      <w:r>
+        <w:t xml:space="preserve">Итого | 5–7 недель |  | 950 ч | 3,8 млн ₽</w:t>
+      </w:r>
+    </w:p>
+    <w:p>
+      <w:r>
+        <w:t xml:space="preserve"/>
+      </w:r>
+    </w:p>
+    <w:p>
+      <w:r>
+        <w:t xml:space="preserve">Результат: MVP для демонстрации и внутренней проверки: загрузка брифа, извлечение данных в JSON, классификация, список недостающих полей и предупреждений.</w:t>
       </w:r>
     </w:p>
     <w:p>
@@ -1231,12 +1281,12 @@
     </w:p>
     <w:p>
       <w:r>
-        <w:t xml:space="preserve">Срок: 14–18 недель.  </w:t>
-      </w:r>
-    </w:p>
-    <w:p>
-      <w:r>
-        <w:t xml:space="preserve">Оценка: 2 550 ч × 4 000 ₽ = 10,2 млн ₽.</w:t>
+        <w:t xml:space="preserve">Срок: 10–14 недель.  </w:t>
+      </w:r>
+    </w:p>
+    <w:p>
+      <w:r>
+        <w:t xml:space="preserve">Оценка: 1 650 ч × 4 000 ₽ = 6,6 млн ₽.</w:t>
       </w:r>
     </w:p>
     <w:p>
@@ -1251,62 +1301,62 @@
     </w:p>
     <w:p>
       <w:r>
-        <w:t xml:space="preserve">Справочники площадок, форматов, ставок, ограничений | 2–3 недели | Backend, системный аналитик, BA | 360 ч | 1,44 млн ₽</w:t>
-      </w:r>
-    </w:p>
-    <w:p>
-      <w:r>
-        <w:t xml:space="preserve">Правила подбора площадок и форматов | 2 недели | Backend, LLM engineer, медиапланинг SME | 320 ч | 1,28 млн ₽</w:t>
-      </w:r>
-    </w:p>
-    <w:p>
-      <w:r>
-        <w:t xml:space="preserve">Расчёт KPI: CPM, CPC, CPL, показы, клики, лиды, охват | 2 недели | Backend, системный аналитик, QA | 300 ч | 1,2 млн ₽</w:t>
-      </w:r>
-    </w:p>
-    <w:p>
-      <w:r>
-        <w:t xml:space="preserve">Генерация Excel по 2–3 основным шаблонам | 2–3 недели | Backend, QA, BA | 360 ч | 1,44 млн ₽</w:t>
-      </w:r>
-    </w:p>
-    <w:p>
-      <w:r>
-        <w:t xml:space="preserve">Хранение проектов, версий результатов и история изменений | 1,5–2 недели | Backend, Frontend | 280 ч | 1,12 млн ₽</w:t>
-      </w:r>
-    </w:p>
-    <w:p>
-      <w:r>
-        <w:t xml:space="preserve">Пользователи, роли, базовые права доступа | 1 неделя | Backend, Frontend, DevOps | 180 ч | 720 тыс. ₽</w:t>
-      </w:r>
-    </w:p>
-    <w:p>
-      <w:r>
-        <w:t xml:space="preserve">Административный интерфейс для справочников | 1,5–2 недели | Frontend, Backend | 260 ч | 1,04 млн ₽</w:t>
-      </w:r>
-    </w:p>
-    <w:p>
-      <w:r>
-        <w:t xml:space="preserve">Журналирование, мониторинг, эксплуатационные настройки | 1 неделя | DevOps, Backend | 170 ч | 680 тыс. ₽</w:t>
-      </w:r>
-    </w:p>
-    <w:p>
-      <w:r>
-        <w:t xml:space="preserve">Полное тестирование, стабилизация, пилотная документация | 2 недели | QA, PM, Tech Lead, BA | 320 ч | 1,28 млн ₽</w:t>
-      </w:r>
-    </w:p>
-    <w:p>
-      <w:r>
-        <w:t xml:space="preserve">Итого | 14–18 недель |  | 2 550 ч | 10,2 млн ₽</w:t>
-      </w:r>
-    </w:p>
-    <w:p>
-      <w:r>
-        <w:t xml:space="preserve"/>
-      </w:r>
-    </w:p>
-    <w:p>
-      <w:r>
-        <w:t xml:space="preserve">Результат: полноценное решение для пилота: от загрузки брифа до Excel-черновика медиаплана с прозрачными допущениями и предупреждениями.</w:t>
+        <w:t xml:space="preserve">Справочники площадок, форматов, ставок, ограничений | 1,5–2 недели | Backend, системный аналитик, BA | 240 ч | 960 тыс. ₽</w:t>
+      </w:r>
+    </w:p>
+    <w:p>
+      <w:r>
+        <w:t xml:space="preserve">Правила подбора площадок и форматов | 1,5–2 недели | Backend, системный аналитик, медиапланинг SME | 220 ч | 880 тыс. ₽</w:t>
+      </w:r>
+    </w:p>
+    <w:p>
+      <w:r>
+        <w:t xml:space="preserve">Расчёт KPI: CPM, CPC, CPL, показы, клики, лиды, охват | 1,5 недели | Backend, системный аналитик, QA | 210 ч | 840 тыс. ₽</w:t>
+      </w:r>
+    </w:p>
+    <w:p>
+      <w:r>
+        <w:t xml:space="preserve">Генерация Excel по 2–3 основным шаблонам | 2 недели | Backend, QA, BA | 250 ч | 1,0 млн ₽</w:t>
+      </w:r>
+    </w:p>
+    <w:p>
+      <w:r>
+        <w:t xml:space="preserve">Хранение проектов, версий результатов и история изменений | 1 неделя | Backend, Frontend | 170 ч | 680 тыс. ₽</w:t>
+      </w:r>
+    </w:p>
+    <w:p>
+      <w:r>
+        <w:t xml:space="preserve">Пользователи, роли, базовые права доступа | 0,5–1 неделя | Backend, Frontend, DevOps | 120 ч | 480 тыс. ₽</w:t>
+      </w:r>
+    </w:p>
+    <w:p>
+      <w:r>
+        <w:t xml:space="preserve">Административный интерфейс для справочников | 1–1,5 недели | Frontend, Backend | 170 ч | 680 тыс. ₽</w:t>
+      </w:r>
+    </w:p>
+    <w:p>
+      <w:r>
+        <w:t xml:space="preserve">Журналирование, мониторинг, эксплуатационные настройки | 0,5–1 неделя | DevOps, Backend | 100 ч | 400 тыс. ₽</w:t>
+      </w:r>
+    </w:p>
+    <w:p>
+      <w:r>
+        <w:t xml:space="preserve">Полное тестирование, стабилизация, пилотная документация | 1,5–2 недели | QA, PM, Технический лидер, BA | 170 ч | 680 тыс. ₽</w:t>
+      </w:r>
+    </w:p>
+    <w:p>
+      <w:r>
+        <w:t xml:space="preserve">Итого | 10–14 недель |  | 1 650 ч | 6,6 млн ₽</w:t>
+      </w:r>
+    </w:p>
+    <w:p>
+      <w:r>
+        <w:t xml:space="preserve"/>
+      </w:r>
+    </w:p>
+    <w:p>
+      <w:r>
+        <w:t xml:space="preserve">Результат: решение для пилота: от загрузки брифа до Excel-черновика медиаплана с прозрачными допущениями и предупреждениями.</w:t>
       </w:r>
     </w:p>
     <w:p>
@@ -1339,7 +1389,7 @@
     </w:p>
     <w:p>
       <w:r>
-        <w:t xml:space="preserve">Бюджет полного цикла — 19,5 млн ₽. Он считается по единой ставке 4 000 ₽/час и суммарной трудоёмкости 4 875 часов. Это оставляет запас до 20 млн ₽ и снижает риск недооценки: аналитика закрывает неопределённость, MVP быстро даёт проверяемый результат, полный этап добавляет расчёты, справочники и production-качество.</w:t>
+        <w:t xml:space="preserve">Бюджет полного цикла — 12,0 млн ₽. Он считается по единой ставке 4 000 ₽/час и суммарной трудоёмкости 3 000 часов. Снижение оценки достигается за счёт компактного MVP, локального контура для разбора брифов и фокусировки полного решения на 2–3 основных шаблонах медиаплана.</w:t>
       </w:r>
     </w:p>
     <w:sectPr>
@@ -1355,14 +1405,13 @@
   <w:style w:type="paragraph" w:default="1" w:styleId="Normal">
     <w:name w:val="Normal"/>
     <w:rPr>
-      <w:rFonts w:ascii="Arial" w:hAnsi="Arial" w:cs="Arial"/>
+      <w:rFonts w:ascii="Arial" w:hAnsi="Arial"/>
       <w:sz w:val="22"/>
     </w:rPr>
   </w:style>
   <w:style w:type="paragraph" w:styleId="Heading1">
     <w:name w:val="heading 1"/>
     <w:basedOn w:val="Normal"/>
-    <w:next w:val="Normal"/>
     <w:rPr>
       <w:b/>
       <w:sz w:val="32"/>
@@ -1371,7 +1420,6 @@
   <w:style w:type="paragraph" w:styleId="Heading2">
     <w:name w:val="heading 2"/>
     <w:basedOn w:val="Normal"/>
-    <w:next w:val="Normal"/>
     <w:rPr>
       <w:b/>
       <w:sz w:val="28"/>
@@ -1380,7 +1428,6 @@
   <w:style w:type="paragraph" w:styleId="Heading3">
     <w:name w:val="heading 3"/>
     <w:basedOn w:val="Normal"/>
-    <w:next w:val="Normal"/>
     <w:rPr>
       <w:b/>
       <w:sz w:val="24"/>

</xml_diff>

<commit_message>
docs: link updated google doc export
</commit_message>
<xml_diff>
--- a/exports/media-rules-export.docx
+++ b/exports/media-rules-export.docx
@@ -37,7 +37,12 @@
     </w:p>
     <w:p>
       <w:r>
-        <w:t xml:space="preserve">Скачать редактируемый DOCX-файл (exports/media-rules-export.docx)</w:t>
+        <w:t xml:space="preserve">Скачать редактируемый DOCX-файл (exports/media-rules-export.docx)  </w:t>
+      </w:r>
+    </w:p>
+    <w:p>
+      <w:r>
+        <w:t xml:space="preserve">Открыть Google Doc (https://docs.google.com/document/d/15gQuLPGD3w1HbEch2DSEN9Rc8ySMzIHcO5ckn7ykwuc/edit)</w:t>
       </w:r>
     </w:p>
     <w:p>

</xml_diff>